<commit_message>
Limpa historico e remove chaves sensiveis
</commit_message>
<xml_diff>
--- a/pcnet-web/backend/modelo_balist_1.docx
+++ b/pcnet-web/backend/modelo_balist_1.docx
@@ -119,6 +119,607 @@
           <w:sz w:val="24"/>
         </w:rPr>
       </w:pPr>
+      <w:r>
+        <w:rPr>
+          <w:rFonts w:ascii="Times-Roman" w:eastAsia="Times-Roman" w:hAnsi="Times-Roman" w:cs="Times-Roman"/>
+          <w:sz w:val="24"/>
+        </w:rPr>
+        <w:t>{#</w:t>
+      </w:r>
+      <w:proofErr w:type="spellStart"/>
+      <w:r>
+        <w:rPr>
+          <w:rFonts w:ascii="Times-Roman" w:eastAsia="Times-Roman" w:hAnsi="Times-Roman" w:cs="Times-Roman"/>
+          <w:sz w:val="24"/>
+        </w:rPr>
+        <w:t>tem_imagem</w:t>
+      </w:r>
+      <w:proofErr w:type="spellEnd"/>
+      <w:r>
+        <w:rPr>
+          <w:rFonts w:ascii="Times-Roman" w:eastAsia="Times-Roman" w:hAnsi="Times-Roman" w:cs="Times-Roman"/>
+          <w:sz w:val="24"/>
+        </w:rPr>
+        <w:t>}</w:t>
+      </w:r>
+    </w:p>
+    <w:p>
+      <w:pPr>
+        <w:pBdr>
+          <w:bottom w:val="doubleDiamonds" w:sz="0" w:space="0" w:color="auto"/>
+        </w:pBdr>
+        <w:spacing w:before="120" w:after="200" w:line="240" w:lineRule="auto"/>
+        <w:rPr>
+          <w:rFonts w:ascii="Times-Roman" w:eastAsia="Times-Roman" w:hAnsi="Times-Roman" w:cs="Times-Roman"/>
+          <w:sz w:val="24"/>
+        </w:rPr>
+      </w:pPr>
+      <w:r>
+        <w:rPr>
+          <w:rFonts w:ascii="Times-Roman" w:eastAsia="Times-Roman" w:hAnsi="Times-Roman" w:cs="Times-Roman"/>
+          <w:sz w:val="24"/>
+        </w:rPr>
+        <w:t>{%</w:t>
+      </w:r>
+      <w:proofErr w:type="spellStart"/>
+      <w:r>
+        <w:rPr>
+          <w:rFonts w:ascii="Times-Roman" w:eastAsia="Times-Roman" w:hAnsi="Times-Roman" w:cs="Times-Roman"/>
+          <w:sz w:val="24"/>
+        </w:rPr>
+        <w:t>imagem_vestigio</w:t>
+      </w:r>
+      <w:proofErr w:type="spellEnd"/>
+      <w:r>
+        <w:rPr>
+          <w:rFonts w:ascii="Times-Roman" w:eastAsia="Times-Roman" w:hAnsi="Times-Roman" w:cs="Times-Roman"/>
+          <w:sz w:val="24"/>
+        </w:rPr>
+        <w:t>}</w:t>
+      </w:r>
+    </w:p>
+    <w:p>
+      <w:pPr>
+        <w:pBdr>
+          <w:bottom w:val="doubleDiamonds" w:sz="0" w:space="0" w:color="auto"/>
+        </w:pBdr>
+        <w:spacing w:before="120" w:after="200" w:line="240" w:lineRule="auto"/>
+        <w:jc w:val="center"/>
+        <w:rPr>
+          <w:rFonts w:ascii="Times-Roman" w:eastAsia="Times-Roman" w:hAnsi="Times-Roman" w:cs="Times-Roman"/>
+          <w:sz w:val="24"/>
+        </w:rPr>
+      </w:pPr>
+      <w:r>
+        <w:rPr>
+          <w:rFonts w:ascii="Times-Roman" w:eastAsia="Times-Roman" w:hAnsi="Times-Roman" w:cs="Times-Roman"/>
+          <w:sz w:val="24"/>
+        </w:rPr>
+        <w:t>Figura 1 - Material enviado a exames periciais.</w:t>
+      </w:r>
+    </w:p>
+    <w:p>
+      <w:pPr>
+        <w:pBdr>
+          <w:bottom w:val="doubleDiamonds" w:sz="0" w:space="0" w:color="auto"/>
+        </w:pBdr>
+        <w:spacing w:before="120" w:after="200" w:line="240" w:lineRule="auto"/>
+        <w:rPr>
+          <w:rFonts w:ascii="Times-Roman" w:eastAsia="Times-Roman" w:hAnsi="Times-Roman" w:cs="Times-Roman"/>
+          <w:sz w:val="24"/>
+        </w:rPr>
+      </w:pPr>
+      <w:r>
+        <w:rPr>
+          <w:rFonts w:ascii="Times-Roman" w:eastAsia="Times-Roman" w:hAnsi="Times-Roman" w:cs="Times-Roman"/>
+          <w:sz w:val="24"/>
+        </w:rPr>
+        <w:t>{/</w:t>
+      </w:r>
+      <w:proofErr w:type="spellStart"/>
+      <w:r>
+        <w:rPr>
+          <w:rFonts w:ascii="Times-Roman" w:eastAsia="Times-Roman" w:hAnsi="Times-Roman" w:cs="Times-Roman"/>
+          <w:sz w:val="24"/>
+        </w:rPr>
+        <w:t>tem_imagem</w:t>
+      </w:r>
+      <w:proofErr w:type="spellEnd"/>
+      <w:r>
+        <w:rPr>
+          <w:rFonts w:ascii="Times-Roman" w:eastAsia="Times-Roman" w:hAnsi="Times-Roman" w:cs="Times-Roman"/>
+          <w:sz w:val="24"/>
+        </w:rPr>
+        <w:t>}</w:t>
+      </w:r>
+    </w:p>
+    <w:p>
+      <w:pPr>
+        <w:pBdr>
+          <w:bottom w:val="doubleDiamonds" w:sz="0" w:space="0" w:color="auto"/>
+        </w:pBdr>
+        <w:spacing w:before="120" w:after="200" w:line="240" w:lineRule="auto"/>
+        <w:rPr>
+          <w:rFonts w:ascii="Times-Roman" w:eastAsia="Times-Roman" w:hAnsi="Times-Roman" w:cs="Times-Roman"/>
+          <w:sz w:val="24"/>
+        </w:rPr>
+      </w:pPr>
+      <w:r>
+        <w:rPr>
+          <w:rFonts w:ascii="Times-Roman" w:eastAsia="Times-Roman" w:hAnsi="Times-Roman" w:cs="Times-Roman"/>
+          <w:sz w:val="24"/>
+        </w:rPr>
+        <w:t>{#</w:t>
+      </w:r>
+      <w:proofErr w:type="spellStart"/>
+      <w:r>
+        <w:rPr>
+          <w:rFonts w:ascii="Times-Roman" w:eastAsia="Times-Roman" w:hAnsi="Times-Roman" w:cs="Times-Roman"/>
+          <w:sz w:val="24"/>
+        </w:rPr>
+        <w:t>is_carabina</w:t>
+      </w:r>
+      <w:proofErr w:type="spellEnd"/>
+      <w:r>
+        <w:rPr>
+          <w:rFonts w:ascii="Times-Roman" w:eastAsia="Times-Roman" w:hAnsi="Times-Roman" w:cs="Times-Roman"/>
+          <w:sz w:val="24"/>
+        </w:rPr>
+        <w:t>}a) 01 (uma) carabina de {</w:t>
+      </w:r>
+      <w:proofErr w:type="spellStart"/>
+      <w:r>
+        <w:rPr>
+          <w:rFonts w:ascii="Times-Roman" w:eastAsia="Times-Roman" w:hAnsi="Times-Roman" w:cs="Times-Roman"/>
+          <w:sz w:val="24"/>
+        </w:rPr>
+        <w:t>tipo_acao_carabina</w:t>
+      </w:r>
+      <w:proofErr w:type="spellEnd"/>
+      <w:r>
+        <w:rPr>
+          <w:rFonts w:ascii="Times-Roman" w:eastAsia="Times-Roman" w:hAnsi="Times-Roman" w:cs="Times-Roman"/>
+          <w:sz w:val="24"/>
+        </w:rPr>
+        <w:t>}{#</w:t>
+      </w:r>
+      <w:proofErr w:type="spellStart"/>
+      <w:r>
+        <w:rPr>
+          <w:rFonts w:ascii="Times-Roman" w:eastAsia="Times-Roman" w:hAnsi="Times-Roman" w:cs="Times-Roman"/>
+          <w:sz w:val="24"/>
+        </w:rPr>
+        <w:t>is_pm</w:t>
+      </w:r>
+      <w:proofErr w:type="spellEnd"/>
+      <w:r>
+        <w:rPr>
+          <w:rFonts w:ascii="Times-Roman" w:eastAsia="Times-Roman" w:hAnsi="Times-Roman" w:cs="Times-Roman"/>
+          <w:sz w:val="24"/>
+        </w:rPr>
+        <w:t>}, pertencente à carga da {</w:t>
+      </w:r>
+      <w:proofErr w:type="spellStart"/>
+      <w:r>
+        <w:rPr>
+          <w:rFonts w:ascii="Times-Roman" w:eastAsia="Times-Roman" w:hAnsi="Times-Roman" w:cs="Times-Roman"/>
+          <w:sz w:val="24"/>
+        </w:rPr>
+        <w:t>instituicao_carga</w:t>
+      </w:r>
+      <w:proofErr w:type="spellEnd"/>
+      <w:r>
+        <w:rPr>
+          <w:rFonts w:ascii="Times-Roman" w:eastAsia="Times-Roman" w:hAnsi="Times-Roman" w:cs="Times-Roman"/>
+          <w:sz w:val="24"/>
+        </w:rPr>
+        <w:t>}{/</w:t>
+      </w:r>
+      <w:proofErr w:type="spellStart"/>
+      <w:r>
+        <w:rPr>
+          <w:rFonts w:ascii="Times-Roman" w:eastAsia="Times-Roman" w:hAnsi="Times-Roman" w:cs="Times-Roman"/>
+          <w:sz w:val="24"/>
+        </w:rPr>
+        <w:t>is_pm</w:t>
+      </w:r>
+      <w:proofErr w:type="spellEnd"/>
+      <w:r>
+        <w:rPr>
+          <w:rFonts w:ascii="Times-Roman" w:eastAsia="Times-Roman" w:hAnsi="Times-Roman" w:cs="Times-Roman"/>
+          <w:sz w:val="24"/>
+        </w:rPr>
+        <w:t>}, calibre {calibre}, marca {marca}, modelo {modelo}, número de série {</w:t>
+      </w:r>
+      <w:proofErr w:type="spellStart"/>
+      <w:r>
+        <w:rPr>
+          <w:rFonts w:ascii="Times-Roman" w:eastAsia="Times-Roman" w:hAnsi="Times-Roman" w:cs="Times-Roman"/>
+          <w:sz w:val="24"/>
+        </w:rPr>
+        <w:t>numero_serie</w:t>
+      </w:r>
+      <w:proofErr w:type="spellEnd"/>
+      <w:r>
+        <w:rPr>
+          <w:rFonts w:ascii="Times-Roman" w:eastAsia="Times-Roman" w:hAnsi="Times-Roman" w:cs="Times-Roman"/>
+          <w:sz w:val="24"/>
+        </w:rPr>
+        <w:t>}, acabamento {acabamento}, {</w:t>
+      </w:r>
+      <w:proofErr w:type="spellStart"/>
+      <w:r>
+        <w:rPr>
+          <w:rFonts w:ascii="Times-Roman" w:eastAsia="Times-Roman" w:hAnsi="Times-Roman" w:cs="Times-Roman"/>
+          <w:sz w:val="24"/>
+        </w:rPr>
+        <w:t>detalhes_coronha</w:t>
+      </w:r>
+      <w:proofErr w:type="spellEnd"/>
+      <w:r>
+        <w:rPr>
+          <w:rFonts w:ascii="Times-Roman" w:eastAsia="Times-Roman" w:hAnsi="Times-Roman" w:cs="Times-Roman"/>
+          <w:sz w:val="24"/>
+        </w:rPr>
+        <w:t>}, alimentação por {</w:t>
+      </w:r>
+      <w:proofErr w:type="spellStart"/>
+      <w:r>
+        <w:rPr>
+          <w:rFonts w:ascii="Times-Roman" w:eastAsia="Times-Roman" w:hAnsi="Times-Roman" w:cs="Times-Roman"/>
+          <w:sz w:val="24"/>
+        </w:rPr>
+        <w:t>sistema_alimentacao</w:t>
+      </w:r>
+      <w:proofErr w:type="spellEnd"/>
+      <w:r>
+        <w:rPr>
+          <w:rFonts w:ascii="Times-Roman" w:eastAsia="Times-Roman" w:hAnsi="Times-Roman" w:cs="Times-Roman"/>
+          <w:sz w:val="24"/>
+        </w:rPr>
+        <w:t>}, capacidade (aferida) de {capacidade} cartuchos, cano medindo {</w:t>
+      </w:r>
+      <w:proofErr w:type="spellStart"/>
+      <w:r>
+        <w:rPr>
+          <w:rFonts w:ascii="Times-Roman" w:eastAsia="Times-Roman" w:hAnsi="Times-Roman" w:cs="Times-Roman"/>
+          <w:sz w:val="24"/>
+        </w:rPr>
+        <w:t>comprimento_cano</w:t>
+      </w:r>
+      <w:proofErr w:type="spellEnd"/>
+      <w:r>
+        <w:rPr>
+          <w:rFonts w:ascii="Times-Roman" w:eastAsia="Times-Roman" w:hAnsi="Times-Roman" w:cs="Times-Roman"/>
+          <w:sz w:val="24"/>
+        </w:rPr>
+        <w:t>} mm e comprimento total de {</w:t>
+      </w:r>
+      <w:proofErr w:type="spellStart"/>
+      <w:r>
+        <w:rPr>
+          <w:rFonts w:ascii="Times-Roman" w:eastAsia="Times-Roman" w:hAnsi="Times-Roman" w:cs="Times-Roman"/>
+          <w:sz w:val="24"/>
+        </w:rPr>
+        <w:t>comprimento_total</w:t>
+      </w:r>
+      <w:proofErr w:type="spellEnd"/>
+      <w:r>
+        <w:rPr>
+          <w:rFonts w:ascii="Times-Roman" w:eastAsia="Times-Roman" w:hAnsi="Times-Roman" w:cs="Times-Roman"/>
+          <w:sz w:val="24"/>
+        </w:rPr>
+        <w:t>} mm (todas as medidas aproximadas).{/</w:t>
+      </w:r>
+      <w:proofErr w:type="spellStart"/>
+      <w:r>
+        <w:rPr>
+          <w:rFonts w:ascii="Times-Roman" w:eastAsia="Times-Roman" w:hAnsi="Times-Roman" w:cs="Times-Roman"/>
+          <w:sz w:val="24"/>
+        </w:rPr>
+        <w:t>is_carabina</w:t>
+      </w:r>
+      <w:proofErr w:type="spellEnd"/>
+      <w:r>
+        <w:rPr>
+          <w:rFonts w:ascii="Times-Roman" w:eastAsia="Times-Roman" w:hAnsi="Times-Roman" w:cs="Times-Roman"/>
+          <w:sz w:val="24"/>
+        </w:rPr>
+        <w:t>}{#</w:t>
+      </w:r>
+      <w:proofErr w:type="spellStart"/>
+      <w:r>
+        <w:rPr>
+          <w:rFonts w:ascii="Times-Roman" w:eastAsia="Times-Roman" w:hAnsi="Times-Roman" w:cs="Times-Roman"/>
+          <w:sz w:val="24"/>
+        </w:rPr>
+        <w:t>is_revolver</w:t>
+      </w:r>
+      <w:proofErr w:type="spellEnd"/>
+      <w:r>
+        <w:rPr>
+          <w:rFonts w:ascii="Times-Roman" w:eastAsia="Times-Roman" w:hAnsi="Times-Roman" w:cs="Times-Roman"/>
+          <w:sz w:val="24"/>
+        </w:rPr>
+        <w:t>}b) 01 (um) revólver{#</w:t>
+      </w:r>
+      <w:proofErr w:type="spellStart"/>
+      <w:r>
+        <w:rPr>
+          <w:rFonts w:ascii="Times-Roman" w:eastAsia="Times-Roman" w:hAnsi="Times-Roman" w:cs="Times-Roman"/>
+          <w:sz w:val="24"/>
+        </w:rPr>
+        <w:t>is_pm</w:t>
+      </w:r>
+      <w:proofErr w:type="spellEnd"/>
+      <w:r>
+        <w:rPr>
+          <w:rFonts w:ascii="Times-Roman" w:eastAsia="Times-Roman" w:hAnsi="Times-Roman" w:cs="Times-Roman"/>
+          <w:sz w:val="24"/>
+        </w:rPr>
+        <w:t>}, pertencente à carga da {</w:t>
+      </w:r>
+      <w:proofErr w:type="spellStart"/>
+      <w:r>
+        <w:rPr>
+          <w:rFonts w:ascii="Times-Roman" w:eastAsia="Times-Roman" w:hAnsi="Times-Roman" w:cs="Times-Roman"/>
+          <w:sz w:val="24"/>
+        </w:rPr>
+        <w:t>instituicao_carga</w:t>
+      </w:r>
+      <w:proofErr w:type="spellEnd"/>
+      <w:r>
+        <w:rPr>
+          <w:rFonts w:ascii="Times-Roman" w:eastAsia="Times-Roman" w:hAnsi="Times-Roman" w:cs="Times-Roman"/>
+          <w:sz w:val="24"/>
+        </w:rPr>
+        <w:t>}{/</w:t>
+      </w:r>
+      <w:proofErr w:type="spellStart"/>
+      <w:r>
+        <w:rPr>
+          <w:rFonts w:ascii="Times-Roman" w:eastAsia="Times-Roman" w:hAnsi="Times-Roman" w:cs="Times-Roman"/>
+          <w:sz w:val="24"/>
+        </w:rPr>
+        <w:t>is_pm</w:t>
+      </w:r>
+      <w:proofErr w:type="spellEnd"/>
+      <w:r>
+        <w:rPr>
+          <w:rFonts w:ascii="Times-Roman" w:eastAsia="Times-Roman" w:hAnsi="Times-Roman" w:cs="Times-Roman"/>
+          <w:sz w:val="24"/>
+        </w:rPr>
+        <w:t>}, calibre {calibre}, marca {marca}, modelo {modelo}, numeração de série {</w:t>
+      </w:r>
+      <w:proofErr w:type="spellStart"/>
+      <w:r>
+        <w:rPr>
+          <w:rFonts w:ascii="Times-Roman" w:eastAsia="Times-Roman" w:hAnsi="Times-Roman" w:cs="Times-Roman"/>
+          <w:sz w:val="24"/>
+        </w:rPr>
+        <w:t>numero_serie</w:t>
+      </w:r>
+      <w:proofErr w:type="spellEnd"/>
+      <w:r>
+        <w:rPr>
+          <w:rFonts w:ascii="Times-Roman" w:eastAsia="Times-Roman" w:hAnsi="Times-Roman" w:cs="Times-Roman"/>
+          <w:sz w:val="24"/>
+        </w:rPr>
+        <w:t>}, cano medindo aproximadamente {</w:t>
+      </w:r>
+      <w:proofErr w:type="spellStart"/>
+      <w:r>
+        <w:rPr>
+          <w:rFonts w:ascii="Times-Roman" w:eastAsia="Times-Roman" w:hAnsi="Times-Roman" w:cs="Times-Roman"/>
+          <w:sz w:val="24"/>
+        </w:rPr>
+        <w:t>comprimento_cano</w:t>
+      </w:r>
+      <w:proofErr w:type="spellEnd"/>
+      <w:r>
+        <w:rPr>
+          <w:rFonts w:ascii="Times-Roman" w:eastAsia="Times-Roman" w:hAnsi="Times-Roman" w:cs="Times-Roman"/>
+          <w:sz w:val="24"/>
+        </w:rPr>
+        <w:t>} mm, comprimento total de {</w:t>
+      </w:r>
+      <w:proofErr w:type="spellStart"/>
+      <w:r>
+        <w:rPr>
+          <w:rFonts w:ascii="Times-Roman" w:eastAsia="Times-Roman" w:hAnsi="Times-Roman" w:cs="Times-Roman"/>
+          <w:sz w:val="24"/>
+        </w:rPr>
+        <w:t>comprimento_total</w:t>
+      </w:r>
+      <w:proofErr w:type="spellEnd"/>
+      <w:r>
+        <w:rPr>
+          <w:rFonts w:ascii="Times-Roman" w:eastAsia="Times-Roman" w:hAnsi="Times-Roman" w:cs="Times-Roman"/>
+          <w:sz w:val="24"/>
+        </w:rPr>
+        <w:t>} mm, acabamento {acabamento}, capacidade para {capacidade} cartuchos, {</w:t>
+      </w:r>
+      <w:proofErr w:type="spellStart"/>
+      <w:r>
+        <w:rPr>
+          <w:rFonts w:ascii="Times-Roman" w:eastAsia="Times-Roman" w:hAnsi="Times-Roman" w:cs="Times-Roman"/>
+          <w:sz w:val="24"/>
+        </w:rPr>
+        <w:t>empunhadura_revolver</w:t>
+      </w:r>
+      <w:proofErr w:type="spellEnd"/>
+      <w:r>
+        <w:rPr>
+          <w:rFonts w:ascii="Times-Roman" w:eastAsia="Times-Roman" w:hAnsi="Times-Roman" w:cs="Times-Roman"/>
+          <w:sz w:val="24"/>
+        </w:rPr>
+        <w:t>} (todas as medidas aproximadas).{/</w:t>
+      </w:r>
+      <w:proofErr w:type="spellStart"/>
+      <w:r>
+        <w:rPr>
+          <w:rFonts w:ascii="Times-Roman" w:eastAsia="Times-Roman" w:hAnsi="Times-Roman" w:cs="Times-Roman"/>
+          <w:sz w:val="24"/>
+        </w:rPr>
+        <w:t>is_revolver</w:t>
+      </w:r>
+      <w:proofErr w:type="spellEnd"/>
+      <w:r>
+        <w:rPr>
+          <w:rFonts w:ascii="Times-Roman" w:eastAsia="Times-Roman" w:hAnsi="Times-Roman" w:cs="Times-Roman"/>
+          <w:sz w:val="24"/>
+        </w:rPr>
+        <w:t>}{#</w:t>
+      </w:r>
+      <w:proofErr w:type="spellStart"/>
+      <w:r>
+        <w:rPr>
+          <w:rFonts w:ascii="Times-Roman" w:eastAsia="Times-Roman" w:hAnsi="Times-Roman" w:cs="Times-Roman"/>
+          <w:sz w:val="24"/>
+        </w:rPr>
+        <w:t>is_pistola</w:t>
+      </w:r>
+      <w:proofErr w:type="spellEnd"/>
+      <w:r>
+        <w:rPr>
+          <w:rFonts w:ascii="Times-Roman" w:eastAsia="Times-Roman" w:hAnsi="Times-Roman" w:cs="Times-Roman"/>
+          <w:sz w:val="24"/>
+        </w:rPr>
+        <w:t>}c) 01 (uma) pistola semiautomática{#</w:t>
+      </w:r>
+      <w:proofErr w:type="spellStart"/>
+      <w:r>
+        <w:rPr>
+          <w:rFonts w:ascii="Times-Roman" w:eastAsia="Times-Roman" w:hAnsi="Times-Roman" w:cs="Times-Roman"/>
+          <w:sz w:val="24"/>
+        </w:rPr>
+        <w:t>is_pm</w:t>
+      </w:r>
+      <w:proofErr w:type="spellEnd"/>
+      <w:r>
+        <w:rPr>
+          <w:rFonts w:ascii="Times-Roman" w:eastAsia="Times-Roman" w:hAnsi="Times-Roman" w:cs="Times-Roman"/>
+          <w:sz w:val="24"/>
+        </w:rPr>
+        <w:t>}, pertencente à carga da {</w:t>
+      </w:r>
+      <w:proofErr w:type="spellStart"/>
+      <w:r>
+        <w:rPr>
+          <w:rFonts w:ascii="Times-Roman" w:eastAsia="Times-Roman" w:hAnsi="Times-Roman" w:cs="Times-Roman"/>
+          <w:sz w:val="24"/>
+        </w:rPr>
+        <w:t>instituicao_carga</w:t>
+      </w:r>
+      <w:proofErr w:type="spellEnd"/>
+      <w:r>
+        <w:rPr>
+          <w:rFonts w:ascii="Times-Roman" w:eastAsia="Times-Roman" w:hAnsi="Times-Roman" w:cs="Times-Roman"/>
+          <w:sz w:val="24"/>
+        </w:rPr>
+        <w:t>}{/</w:t>
+      </w:r>
+      <w:proofErr w:type="spellStart"/>
+      <w:r>
+        <w:rPr>
+          <w:rFonts w:ascii="Times-Roman" w:eastAsia="Times-Roman" w:hAnsi="Times-Roman" w:cs="Times-Roman"/>
+          <w:sz w:val="24"/>
+        </w:rPr>
+        <w:t>is_pm</w:t>
+      </w:r>
+      <w:proofErr w:type="spellEnd"/>
+      <w:r>
+        <w:rPr>
+          <w:rFonts w:ascii="Times-Roman" w:eastAsia="Times-Roman" w:hAnsi="Times-Roman" w:cs="Times-Roman"/>
+          <w:sz w:val="24"/>
+        </w:rPr>
+        <w:t>}, calibre {calibre}, marca {marca}, modelo {modelo}, número de série {</w:t>
+      </w:r>
+      <w:proofErr w:type="spellStart"/>
+      <w:r>
+        <w:rPr>
+          <w:rFonts w:ascii="Times-Roman" w:eastAsia="Times-Roman" w:hAnsi="Times-Roman" w:cs="Times-Roman"/>
+          <w:sz w:val="24"/>
+        </w:rPr>
+        <w:t>numero_serie</w:t>
+      </w:r>
+      <w:proofErr w:type="spellEnd"/>
+      <w:r>
+        <w:rPr>
+          <w:rFonts w:ascii="Times-Roman" w:eastAsia="Times-Roman" w:hAnsi="Times-Roman" w:cs="Times-Roman"/>
+          <w:sz w:val="24"/>
+        </w:rPr>
+        <w:t>}, cano medindo aproximadamente {</w:t>
+      </w:r>
+      <w:proofErr w:type="spellStart"/>
+      <w:r>
+        <w:rPr>
+          <w:rFonts w:ascii="Times-Roman" w:eastAsia="Times-Roman" w:hAnsi="Times-Roman" w:cs="Times-Roman"/>
+          <w:sz w:val="24"/>
+        </w:rPr>
+        <w:t>comprimento_cano</w:t>
+      </w:r>
+      <w:proofErr w:type="spellEnd"/>
+      <w:r>
+        <w:rPr>
+          <w:rFonts w:ascii="Times-Roman" w:eastAsia="Times-Roman" w:hAnsi="Times-Roman" w:cs="Times-Roman"/>
+          <w:sz w:val="24"/>
+        </w:rPr>
+        <w:t>} mm, acabamento {</w:t>
+      </w:r>
+      <w:r>
+        <w:rPr>
+          <w:rFonts w:ascii="Times-Roman" w:eastAsia="Times-Roman" w:hAnsi="Times-Roman" w:cs="Times-Roman"/>
+          <w:sz w:val="24"/>
+        </w:rPr>
+        <w:t>acabamento}, {</w:t>
+      </w:r>
+      <w:proofErr w:type="spellStart"/>
+      <w:r>
+        <w:rPr>
+          <w:rFonts w:ascii="Times-Roman" w:eastAsia="Times-Roman" w:hAnsi="Times-Roman" w:cs="Times-Roman"/>
+          <w:sz w:val="24"/>
+        </w:rPr>
+        <w:t>detalhes_armacao</w:t>
+      </w:r>
+      <w:proofErr w:type="spellEnd"/>
+      <w:r>
+        <w:rPr>
+          <w:rFonts w:ascii="Times-Roman" w:eastAsia="Times-Roman" w:hAnsi="Times-Roman" w:cs="Times-Roman"/>
+          <w:sz w:val="24"/>
+        </w:rPr>
+        <w:t xml:space="preserve">}, </w:t>
+      </w:r>
+      <w:r>
+        <w:rPr>
+          <w:rFonts w:ascii="Times-Roman" w:eastAsia="Times-Roman" w:hAnsi="Times-Roman" w:cs="Times-Roman"/>
+          <w:sz w:val="24"/>
+        </w:rPr>
+        <w:t>{</w:t>
+      </w:r>
+      <w:proofErr w:type="spellStart"/>
+      <w:r>
+        <w:rPr>
+          <w:rFonts w:ascii="Times-Roman" w:eastAsia="Times-Roman" w:hAnsi="Times-Roman" w:cs="Times-Roman"/>
+          <w:sz w:val="24"/>
+        </w:rPr>
+        <w:t>carregador_info</w:t>
+      </w:r>
+      <w:proofErr w:type="spellEnd"/>
+      <w:r>
+        <w:rPr>
+          <w:rFonts w:ascii="Times-Roman" w:eastAsia="Times-Roman" w:hAnsi="Times-Roman" w:cs="Times-Roman"/>
+          <w:sz w:val="24"/>
+        </w:rPr>
+        <w:t>}</w:t>
+      </w:r>
+      <w:r>
+        <w:rPr>
+          <w:rFonts w:ascii="Times-Roman" w:eastAsia="Times-Roman" w:hAnsi="Times-Roman" w:cs="Times-Roman"/>
+          <w:sz w:val="24"/>
+        </w:rPr>
+        <w:t>.</w:t>
+      </w:r>
       <w:bookmarkStart w:id="0" w:name="_GoBack"/>
       <w:bookmarkEnd w:id="0"/>
       <w:r>
@@ -126,31 +727,15 @@
           <w:rFonts w:ascii="Times-Roman" w:eastAsia="Times-Roman" w:hAnsi="Times-Roman" w:cs="Times-Roman"/>
           <w:sz w:val="24"/>
         </w:rPr>
-        <w:t>{#</w:t>
-      </w:r>
-      <w:proofErr w:type="spellStart"/>
-      <w:r>
-        <w:rPr>
-          <w:rFonts w:ascii="Times-Roman" w:eastAsia="Times-Roman" w:hAnsi="Times-Roman" w:cs="Times-Roman"/>
-          <w:sz w:val="24"/>
-        </w:rPr>
-        <w:t>is_carabina</w:t>
-      </w:r>
-      <w:proofErr w:type="spellEnd"/>
-      <w:r>
-        <w:rPr>
-          <w:rFonts w:ascii="Times-Roman" w:eastAsia="Times-Roman" w:hAnsi="Times-Roman" w:cs="Times-Roman"/>
-          <w:sz w:val="24"/>
-        </w:rPr>
-        <w:t>}a) 01 (uma) carabina de {</w:t>
-      </w:r>
-      <w:proofErr w:type="spellStart"/>
-      <w:r>
-        <w:rPr>
-          <w:rFonts w:ascii="Times-Roman" w:eastAsia="Times-Roman" w:hAnsi="Times-Roman" w:cs="Times-Roman"/>
-          <w:sz w:val="24"/>
-        </w:rPr>
-        <w:t>tipo_acao_carabina</w:t>
+        <w:t xml:space="preserve"> (todas as medidas aproximadas).{/</w:t>
+      </w:r>
+      <w:proofErr w:type="spellStart"/>
+      <w:r>
+        <w:rPr>
+          <w:rFonts w:ascii="Times-Roman" w:eastAsia="Times-Roman" w:hAnsi="Times-Roman" w:cs="Times-Roman"/>
+          <w:sz w:val="24"/>
+        </w:rPr>
+        <w:t>is_pistola</w:t>
       </w:r>
       <w:proofErr w:type="spellEnd"/>
       <w:r>
@@ -166,6 +751,22 @@
           <w:rFonts w:ascii="Times-Roman" w:eastAsia="Times-Roman" w:hAnsi="Times-Roman" w:cs="Times-Roman"/>
           <w:sz w:val="24"/>
         </w:rPr>
+        <w:t>is_fuzil</w:t>
+      </w:r>
+      <w:proofErr w:type="spellEnd"/>
+      <w:r>
+        <w:rPr>
+          <w:rFonts w:ascii="Times-Roman" w:eastAsia="Times-Roman" w:hAnsi="Times-Roman" w:cs="Times-Roman"/>
+          <w:sz w:val="24"/>
+        </w:rPr>
+        <w:t>}d) 01 (um) fuzil semiautomático{#</w:t>
+      </w:r>
+      <w:proofErr w:type="spellStart"/>
+      <w:r>
+        <w:rPr>
+          <w:rFonts w:ascii="Times-Roman" w:eastAsia="Times-Roman" w:hAnsi="Times-Roman" w:cs="Times-Roman"/>
+          <w:sz w:val="24"/>
+        </w:rPr>
         <w:t>is_pm</w:t>
       </w:r>
       <w:proofErr w:type="spellEnd"/>
@@ -230,31 +831,15 @@
           <w:rFonts w:ascii="Times-Roman" w:eastAsia="Times-Roman" w:hAnsi="Times-Roman" w:cs="Times-Roman"/>
           <w:sz w:val="24"/>
         </w:rPr>
-        <w:t>detalhes_coronha</w:t>
-      </w:r>
-      <w:proofErr w:type="spellEnd"/>
-      <w:r>
-        <w:rPr>
-          <w:rFonts w:ascii="Times-Roman" w:eastAsia="Times-Roman" w:hAnsi="Times-Roman" w:cs="Times-Roman"/>
-          <w:sz w:val="24"/>
-        </w:rPr>
-        <w:t>}, alimentação por {</w:t>
-      </w:r>
-      <w:proofErr w:type="spellStart"/>
-      <w:r>
-        <w:rPr>
-          <w:rFonts w:ascii="Times-Roman" w:eastAsia="Times-Roman" w:hAnsi="Times-Roman" w:cs="Times-Roman"/>
-          <w:sz w:val="24"/>
-        </w:rPr>
-        <w:t>sistema_alimentacao</w:t>
-      </w:r>
-      <w:proofErr w:type="spellEnd"/>
-      <w:r>
-        <w:rPr>
-          <w:rFonts w:ascii="Times-Roman" w:eastAsia="Times-Roman" w:hAnsi="Times-Roman" w:cs="Times-Roman"/>
-          <w:sz w:val="24"/>
-        </w:rPr>
-        <w:t>}, capacidade (aferida) de {capacidade} cartuchos, cano medindo {</w:t>
+        <w:t>detalhes_fuzil</w:t>
+      </w:r>
+      <w:proofErr w:type="spellEnd"/>
+      <w:r>
+        <w:rPr>
+          <w:rFonts w:ascii="Times-Roman" w:eastAsia="Times-Roman" w:hAnsi="Times-Roman" w:cs="Times-Roman"/>
+          <w:sz w:val="24"/>
+        </w:rPr>
+        <w:t>}, cano medindo aproximadamente {</w:t>
       </w:r>
       <w:proofErr w:type="spellStart"/>
       <w:r>
@@ -270,31 +855,15 @@
           <w:rFonts w:ascii="Times-Roman" w:eastAsia="Times-Roman" w:hAnsi="Times-Roman" w:cs="Times-Roman"/>
           <w:sz w:val="24"/>
         </w:rPr>
-        <w:t>} mm e comprimento total de {</w:t>
-      </w:r>
-      <w:proofErr w:type="spellStart"/>
-      <w:r>
-        <w:rPr>
-          <w:rFonts w:ascii="Times-Roman" w:eastAsia="Times-Roman" w:hAnsi="Times-Roman" w:cs="Times-Roman"/>
-          <w:sz w:val="24"/>
-        </w:rPr>
-        <w:t>comprimento_total</w:t>
-      </w:r>
-      <w:proofErr w:type="spellEnd"/>
-      <w:r>
-        <w:rPr>
-          <w:rFonts w:ascii="Times-Roman" w:eastAsia="Times-Roman" w:hAnsi="Times-Roman" w:cs="Times-Roman"/>
-          <w:sz w:val="24"/>
-        </w:rPr>
-        <w:t>} mm (todas as medidas aproximadas).{/</w:t>
-      </w:r>
-      <w:proofErr w:type="spellStart"/>
-      <w:r>
-        <w:rPr>
-          <w:rFonts w:ascii="Times-Roman" w:eastAsia="Times-Roman" w:hAnsi="Times-Roman" w:cs="Times-Roman"/>
-          <w:sz w:val="24"/>
-        </w:rPr>
-        <w:t>is_carabina</w:t>
+        <w:t>} mm de comprimento (todas as medidas aproximadas);{/</w:t>
+      </w:r>
+      <w:proofErr w:type="spellStart"/>
+      <w:r>
+        <w:rPr>
+          <w:rFonts w:ascii="Times-Roman" w:eastAsia="Times-Roman" w:hAnsi="Times-Roman" w:cs="Times-Roman"/>
+          <w:sz w:val="24"/>
+        </w:rPr>
+        <w:t>is_fuzil</w:t>
       </w:r>
       <w:proofErr w:type="spellEnd"/>
       <w:r>
@@ -310,15 +879,96 @@
           <w:rFonts w:ascii="Times-Roman" w:eastAsia="Times-Roman" w:hAnsi="Times-Roman" w:cs="Times-Roman"/>
           <w:sz w:val="24"/>
         </w:rPr>
-        <w:t>is_revolver</w:t>
-      </w:r>
-      <w:proofErr w:type="spellEnd"/>
-      <w:r>
-        <w:rPr>
-          <w:rFonts w:ascii="Times-Roman" w:eastAsia="Times-Roman" w:hAnsi="Times-Roman" w:cs="Times-Roman"/>
-          <w:sz w:val="24"/>
-        </w:rPr>
-        <w:t>}b) 01 (um) revólver{#</w:t>
+        <w:t>is_municao_isolada</w:t>
+      </w:r>
+      <w:proofErr w:type="spellEnd"/>
+      <w:r>
+        <w:rPr>
+          <w:rFonts w:ascii="Times-Roman" w:eastAsia="Times-Roman" w:hAnsi="Times-Roman" w:cs="Times-Roman"/>
+          <w:sz w:val="24"/>
+        </w:rPr>
+        <w:t>}</w:t>
+      </w:r>
+      <w:r>
+        <w:t xml:space="preserve"> </w:t>
+      </w:r>
+      <w:r>
+        <w:rPr>
+          <w:rFonts w:ascii="Times-Roman" w:eastAsia="Times-Roman" w:hAnsi="Times-Roman" w:cs="Times-Roman"/>
+          <w:sz w:val="24"/>
+        </w:rPr>
+        <w:t>e) {</w:t>
+      </w:r>
+      <w:proofErr w:type="spellStart"/>
+      <w:r>
+        <w:rPr>
+          <w:rFonts w:ascii="Times-Roman" w:eastAsia="Times-Roman" w:hAnsi="Times-Roman" w:cs="Times-Roman"/>
+          <w:sz w:val="24"/>
+        </w:rPr>
+        <w:t>municoes_detalhes</w:t>
+      </w:r>
+      <w:proofErr w:type="spellEnd"/>
+      <w:r>
+        <w:rPr>
+          <w:rFonts w:ascii="Times-Roman" w:eastAsia="Times-Roman" w:hAnsi="Times-Roman" w:cs="Times-Roman"/>
+          <w:sz w:val="24"/>
+        </w:rPr>
+        <w:t xml:space="preserve">} </w:t>
+      </w:r>
+      <w:r>
+        <w:rPr>
+          <w:rFonts w:ascii="Times-Roman" w:eastAsia="Times-Roman" w:hAnsi="Times-Roman" w:cs="Times-Roman"/>
+          <w:sz w:val="24"/>
+        </w:rPr>
+        <w:t>{/</w:t>
+      </w:r>
+      <w:proofErr w:type="spellStart"/>
+      <w:r>
+        <w:rPr>
+          <w:rFonts w:ascii="Times-Roman" w:eastAsia="Times-Roman" w:hAnsi="Times-Roman" w:cs="Times-Roman"/>
+          <w:sz w:val="24"/>
+        </w:rPr>
+        <w:t>is_municao_isolada</w:t>
+      </w:r>
+      <w:proofErr w:type="spellEnd"/>
+      <w:r>
+        <w:rPr>
+          <w:rFonts w:ascii="Times-Roman" w:eastAsia="Times-Roman" w:hAnsi="Times-Roman" w:cs="Times-Roman"/>
+          <w:sz w:val="24"/>
+        </w:rPr>
+        <w:t>}{#</w:t>
+      </w:r>
+      <w:proofErr w:type="spellStart"/>
+      <w:r>
+        <w:rPr>
+          <w:rFonts w:ascii="Times-Roman" w:eastAsia="Times-Roman" w:hAnsi="Times-Roman" w:cs="Times-Roman"/>
+          <w:sz w:val="24"/>
+        </w:rPr>
+        <w:t>is_coringa</w:t>
+      </w:r>
+      <w:proofErr w:type="spellEnd"/>
+      <w:r>
+        <w:rPr>
+          <w:rFonts w:ascii="Times-Roman" w:eastAsia="Times-Roman" w:hAnsi="Times-Roman" w:cs="Times-Roman"/>
+          <w:sz w:val="24"/>
+        </w:rPr>
+        <w:t>}f) 01 (uma) {</w:t>
+      </w:r>
+      <w:proofErr w:type="spellStart"/>
+      <w:r>
+        <w:rPr>
+          <w:rFonts w:ascii="Times-Roman" w:eastAsia="Times-Roman" w:hAnsi="Times-Roman" w:cs="Times-Roman"/>
+          <w:sz w:val="24"/>
+        </w:rPr>
+        <w:t>nome_arma_livre</w:t>
+      </w:r>
+      <w:proofErr w:type="spellEnd"/>
+      <w:r>
+        <w:rPr>
+          <w:rFonts w:ascii="Times-Roman" w:eastAsia="Times-Roman" w:hAnsi="Times-Roman" w:cs="Times-Roman"/>
+          <w:sz w:val="24"/>
+        </w:rPr>
+        <w:t>}{#</w:t>
       </w:r>
       <w:proofErr w:type="spellStart"/>
       <w:r>
@@ -366,7 +1016,7 @@
           <w:rFonts w:ascii="Times-Roman" w:eastAsia="Times-Roman" w:hAnsi="Times-Roman" w:cs="Times-Roman"/>
           <w:sz w:val="24"/>
         </w:rPr>
-        <w:t>}, calibre {calibre}, marca {marca}, modelo {modelo}, numeração de série {</w:t>
+        <w:t>}, calibre {calibre}, marca {marca}, modelo {modelo}, número de série {</w:t>
       </w:r>
       <w:proofErr w:type="spellStart"/>
       <w:r>
@@ -382,294 +1032,6 @@
           <w:rFonts w:ascii="Times-Roman" w:eastAsia="Times-Roman" w:hAnsi="Times-Roman" w:cs="Times-Roman"/>
           <w:sz w:val="24"/>
         </w:rPr>
-        <w:t>}, cano medindo aproximadamente {</w:t>
-      </w:r>
-      <w:proofErr w:type="spellStart"/>
-      <w:r>
-        <w:rPr>
-          <w:rFonts w:ascii="Times-Roman" w:eastAsia="Times-Roman" w:hAnsi="Times-Roman" w:cs="Times-Roman"/>
-          <w:sz w:val="24"/>
-        </w:rPr>
-        <w:t>comprimento_cano</w:t>
-      </w:r>
-      <w:proofErr w:type="spellEnd"/>
-      <w:r>
-        <w:rPr>
-          <w:rFonts w:ascii="Times-Roman" w:eastAsia="Times-Roman" w:hAnsi="Times-Roman" w:cs="Times-Roman"/>
-          <w:sz w:val="24"/>
-        </w:rPr>
-        <w:t>} mm, comprimento total de {</w:t>
-      </w:r>
-      <w:proofErr w:type="spellStart"/>
-      <w:r>
-        <w:rPr>
-          <w:rFonts w:ascii="Times-Roman" w:eastAsia="Times-Roman" w:hAnsi="Times-Roman" w:cs="Times-Roman"/>
-          <w:sz w:val="24"/>
-        </w:rPr>
-        <w:t>comprimento_total</w:t>
-      </w:r>
-      <w:proofErr w:type="spellEnd"/>
-      <w:r>
-        <w:rPr>
-          <w:rFonts w:ascii="Times-Roman" w:eastAsia="Times-Roman" w:hAnsi="Times-Roman" w:cs="Times-Roman"/>
-          <w:sz w:val="24"/>
-        </w:rPr>
-        <w:t>} mm, acabamento {acabamento}, capacidade para {capacidade} cartuchos, {</w:t>
-      </w:r>
-      <w:proofErr w:type="spellStart"/>
-      <w:r>
-        <w:rPr>
-          <w:rFonts w:ascii="Times-Roman" w:eastAsia="Times-Roman" w:hAnsi="Times-Roman" w:cs="Times-Roman"/>
-          <w:sz w:val="24"/>
-        </w:rPr>
-        <w:t>empunhadura_revolver</w:t>
-      </w:r>
-      <w:proofErr w:type="spellEnd"/>
-      <w:r>
-        <w:rPr>
-          <w:rFonts w:ascii="Times-Roman" w:eastAsia="Times-Roman" w:hAnsi="Times-Roman" w:cs="Times-Roman"/>
-          <w:sz w:val="24"/>
-        </w:rPr>
-        <w:t>} (todas as medidas aproximadas).{/</w:t>
-      </w:r>
-      <w:proofErr w:type="spellStart"/>
-      <w:r>
-        <w:rPr>
-          <w:rFonts w:ascii="Times-Roman" w:eastAsia="Times-Roman" w:hAnsi="Times-Roman" w:cs="Times-Roman"/>
-          <w:sz w:val="24"/>
-        </w:rPr>
-        <w:t>is_revolver</w:t>
-      </w:r>
-      <w:proofErr w:type="spellEnd"/>
-      <w:r>
-        <w:rPr>
-          <w:rFonts w:ascii="Times-Roman" w:eastAsia="Times-Roman" w:hAnsi="Times-Roman" w:cs="Times-Roman"/>
-          <w:sz w:val="24"/>
-        </w:rPr>
-        <w:t>}{#</w:t>
-      </w:r>
-      <w:proofErr w:type="spellStart"/>
-      <w:r>
-        <w:rPr>
-          <w:rFonts w:ascii="Times-Roman" w:eastAsia="Times-Roman" w:hAnsi="Times-Roman" w:cs="Times-Roman"/>
-          <w:sz w:val="24"/>
-        </w:rPr>
-        <w:t>is_pistola</w:t>
-      </w:r>
-      <w:proofErr w:type="spellEnd"/>
-      <w:r>
-        <w:rPr>
-          <w:rFonts w:ascii="Times-Roman" w:eastAsia="Times-Roman" w:hAnsi="Times-Roman" w:cs="Times-Roman"/>
-          <w:sz w:val="24"/>
-        </w:rPr>
-        <w:t>}c) 01 (uma) pistola semiautomática{#</w:t>
-      </w:r>
-      <w:proofErr w:type="spellStart"/>
-      <w:r>
-        <w:rPr>
-          <w:rFonts w:ascii="Times-Roman" w:eastAsia="Times-Roman" w:hAnsi="Times-Roman" w:cs="Times-Roman"/>
-          <w:sz w:val="24"/>
-        </w:rPr>
-        <w:t>is_pm</w:t>
-      </w:r>
-      <w:proofErr w:type="spellEnd"/>
-      <w:r>
-        <w:rPr>
-          <w:rFonts w:ascii="Times-Roman" w:eastAsia="Times-Roman" w:hAnsi="Times-Roman" w:cs="Times-Roman"/>
-          <w:sz w:val="24"/>
-        </w:rPr>
-        <w:t>}, pertencente à carga da {</w:t>
-      </w:r>
-      <w:proofErr w:type="spellStart"/>
-      <w:r>
-        <w:rPr>
-          <w:rFonts w:ascii="Times-Roman" w:eastAsia="Times-Roman" w:hAnsi="Times-Roman" w:cs="Times-Roman"/>
-          <w:sz w:val="24"/>
-        </w:rPr>
-        <w:t>instituicao_carga</w:t>
-      </w:r>
-      <w:proofErr w:type="spellEnd"/>
-      <w:r>
-        <w:rPr>
-          <w:rFonts w:ascii="Times-Roman" w:eastAsia="Times-Roman" w:hAnsi="Times-Roman" w:cs="Times-Roman"/>
-          <w:sz w:val="24"/>
-        </w:rPr>
-        <w:t>}{/</w:t>
-      </w:r>
-      <w:proofErr w:type="spellStart"/>
-      <w:r>
-        <w:rPr>
-          <w:rFonts w:ascii="Times-Roman" w:eastAsia="Times-Roman" w:hAnsi="Times-Roman" w:cs="Times-Roman"/>
-          <w:sz w:val="24"/>
-        </w:rPr>
-        <w:t>is_pm</w:t>
-      </w:r>
-      <w:proofErr w:type="spellEnd"/>
-      <w:r>
-        <w:rPr>
-          <w:rFonts w:ascii="Times-Roman" w:eastAsia="Times-Roman" w:hAnsi="Times-Roman" w:cs="Times-Roman"/>
-          <w:sz w:val="24"/>
-        </w:rPr>
-        <w:t>}, calibre {calibre}, marca {marca}, modelo {modelo}, número de série {</w:t>
-      </w:r>
-      <w:proofErr w:type="spellStart"/>
-      <w:r>
-        <w:rPr>
-          <w:rFonts w:ascii="Times-Roman" w:eastAsia="Times-Roman" w:hAnsi="Times-Roman" w:cs="Times-Roman"/>
-          <w:sz w:val="24"/>
-        </w:rPr>
-        <w:t>numero_serie</w:t>
-      </w:r>
-      <w:proofErr w:type="spellEnd"/>
-      <w:r>
-        <w:rPr>
-          <w:rFonts w:ascii="Times-Roman" w:eastAsia="Times-Roman" w:hAnsi="Times-Roman" w:cs="Times-Roman"/>
-          <w:sz w:val="24"/>
-        </w:rPr>
-        <w:t>}, cano medindo aproximadamente {</w:t>
-      </w:r>
-      <w:proofErr w:type="spellStart"/>
-      <w:r>
-        <w:rPr>
-          <w:rFonts w:ascii="Times-Roman" w:eastAsia="Times-Roman" w:hAnsi="Times-Roman" w:cs="Times-Roman"/>
-          <w:sz w:val="24"/>
-        </w:rPr>
-        <w:t>comprimento_cano</w:t>
-      </w:r>
-      <w:proofErr w:type="spellEnd"/>
-      <w:r>
-        <w:rPr>
-          <w:rFonts w:ascii="Times-Roman" w:eastAsia="Times-Roman" w:hAnsi="Times-Roman" w:cs="Times-Roman"/>
-          <w:sz w:val="24"/>
-        </w:rPr>
-        <w:t>} mm, acabamento {acabamento}, {</w:t>
-      </w:r>
-      <w:proofErr w:type="spellStart"/>
-      <w:r>
-        <w:rPr>
-          <w:rFonts w:ascii="Times-Roman" w:eastAsia="Times-Roman" w:hAnsi="Times-Roman" w:cs="Times-Roman"/>
-          <w:sz w:val="24"/>
-        </w:rPr>
-        <w:t>detalhes_armacao</w:t>
-      </w:r>
-      <w:proofErr w:type="spellEnd"/>
-      <w:r>
-        <w:rPr>
-          <w:rFonts w:ascii="Times-Roman" w:eastAsia="Times-Roman" w:hAnsi="Times-Roman" w:cs="Times-Roman"/>
-          <w:sz w:val="24"/>
-        </w:rPr>
-        <w:t>} e {</w:t>
-      </w:r>
-      <w:proofErr w:type="spellStart"/>
-      <w:r>
-        <w:rPr>
-          <w:rFonts w:ascii="Times-Roman" w:eastAsia="Times-Roman" w:hAnsi="Times-Roman" w:cs="Times-Roman"/>
-          <w:sz w:val="24"/>
-        </w:rPr>
-        <w:t>carregador_info</w:t>
-      </w:r>
-      <w:proofErr w:type="spellEnd"/>
-      <w:r>
-        <w:rPr>
-          <w:rFonts w:ascii="Times-Roman" w:eastAsia="Times-Roman" w:hAnsi="Times-Roman" w:cs="Times-Roman"/>
-          <w:sz w:val="24"/>
-        </w:rPr>
-        <w:t>} (todas as medidas aproximadas).{/</w:t>
-      </w:r>
-      <w:proofErr w:type="spellStart"/>
-      <w:r>
-        <w:rPr>
-          <w:rFonts w:ascii="Times-Roman" w:eastAsia="Times-Roman" w:hAnsi="Times-Roman" w:cs="Times-Roman"/>
-          <w:sz w:val="24"/>
-        </w:rPr>
-        <w:t>is_pistola</w:t>
-      </w:r>
-      <w:proofErr w:type="spellEnd"/>
-      <w:r>
-        <w:rPr>
-          <w:rFonts w:ascii="Times-Roman" w:eastAsia="Times-Roman" w:hAnsi="Times-Roman" w:cs="Times-Roman"/>
-          <w:sz w:val="24"/>
-        </w:rPr>
-        <w:t>}{#</w:t>
-      </w:r>
-      <w:proofErr w:type="spellStart"/>
-      <w:r>
-        <w:rPr>
-          <w:rFonts w:ascii="Times-Roman" w:eastAsia="Times-Roman" w:hAnsi="Times-Roman" w:cs="Times-Roman"/>
-          <w:sz w:val="24"/>
-        </w:rPr>
-        <w:t>is_fuzil</w:t>
-      </w:r>
-      <w:proofErr w:type="spellEnd"/>
-      <w:r>
-        <w:rPr>
-          <w:rFonts w:ascii="Times-Roman" w:eastAsia="Times-Roman" w:hAnsi="Times-Roman" w:cs="Times-Roman"/>
-          <w:sz w:val="24"/>
-        </w:rPr>
-        <w:t>}d) 01 (um) fuzil semiautomático{#</w:t>
-      </w:r>
-      <w:proofErr w:type="spellStart"/>
-      <w:r>
-        <w:rPr>
-          <w:rFonts w:ascii="Times-Roman" w:eastAsia="Times-Roman" w:hAnsi="Times-Roman" w:cs="Times-Roman"/>
-          <w:sz w:val="24"/>
-        </w:rPr>
-        <w:t>is_pm</w:t>
-      </w:r>
-      <w:proofErr w:type="spellEnd"/>
-      <w:r>
-        <w:rPr>
-          <w:rFonts w:ascii="Times-Roman" w:eastAsia="Times-Roman" w:hAnsi="Times-Roman" w:cs="Times-Roman"/>
-          <w:sz w:val="24"/>
-        </w:rPr>
-        <w:t>}, pertencente à carga da {</w:t>
-      </w:r>
-      <w:proofErr w:type="spellStart"/>
-      <w:r>
-        <w:rPr>
-          <w:rFonts w:ascii="Times-Roman" w:eastAsia="Times-Roman" w:hAnsi="Times-Roman" w:cs="Times-Roman"/>
-          <w:sz w:val="24"/>
-        </w:rPr>
-        <w:t>instituicao_carga</w:t>
-      </w:r>
-      <w:proofErr w:type="spellEnd"/>
-      <w:r>
-        <w:rPr>
-          <w:rFonts w:ascii="Times-Roman" w:eastAsia="Times-Roman" w:hAnsi="Times-Roman" w:cs="Times-Roman"/>
-          <w:sz w:val="24"/>
-        </w:rPr>
-        <w:t>}{/</w:t>
-      </w:r>
-      <w:proofErr w:type="spellStart"/>
-      <w:r>
-        <w:rPr>
-          <w:rFonts w:ascii="Times-Roman" w:eastAsia="Times-Roman" w:hAnsi="Times-Roman" w:cs="Times-Roman"/>
-          <w:sz w:val="24"/>
-        </w:rPr>
-        <w:t>is_pm</w:t>
-      </w:r>
-      <w:proofErr w:type="spellEnd"/>
-      <w:r>
-        <w:rPr>
-          <w:rFonts w:ascii="Times-Roman" w:eastAsia="Times-Roman" w:hAnsi="Times-Roman" w:cs="Times-Roman"/>
-          <w:sz w:val="24"/>
-        </w:rPr>
-        <w:t>}, calibre {calibre}, marca {marca}, modelo {modelo}, número de série {</w:t>
-      </w:r>
-      <w:proofErr w:type="spellStart"/>
-      <w:r>
-        <w:rPr>
-          <w:rFonts w:ascii="Times-Roman" w:eastAsia="Times-Roman" w:hAnsi="Times-Roman" w:cs="Times-Roman"/>
-          <w:sz w:val="24"/>
-        </w:rPr>
-        <w:t>numero_serie</w:t>
-      </w:r>
-      <w:proofErr w:type="spellEnd"/>
-      <w:r>
-        <w:rPr>
-          <w:rFonts w:ascii="Times-Roman" w:eastAsia="Times-Roman" w:hAnsi="Times-Roman" w:cs="Times-Roman"/>
-          <w:sz w:val="24"/>
-        </w:rPr>
         <w:t>}, acabamento {acabamento}, {</w:t>
       </w:r>
       <w:proofErr w:type="spellStart"/>
@@ -678,215 +1040,6 @@
           <w:rFonts w:ascii="Times-Roman" w:eastAsia="Times-Roman" w:hAnsi="Times-Roman" w:cs="Times-Roman"/>
           <w:sz w:val="24"/>
         </w:rPr>
-        <w:t>detalhes_fuzil</w:t>
-      </w:r>
-      <w:proofErr w:type="spellEnd"/>
-      <w:r>
-        <w:rPr>
-          <w:rFonts w:ascii="Times-Roman" w:eastAsia="Times-Roman" w:hAnsi="Times-Roman" w:cs="Times-Roman"/>
-          <w:sz w:val="24"/>
-        </w:rPr>
-        <w:t>}, cano medindo aproximadamente {</w:t>
-      </w:r>
-      <w:proofErr w:type="spellStart"/>
-      <w:r>
-        <w:rPr>
-          <w:rFonts w:ascii="Times-Roman" w:eastAsia="Times-Roman" w:hAnsi="Times-Roman" w:cs="Times-Roman"/>
-          <w:sz w:val="24"/>
-        </w:rPr>
-        <w:t>comprimento_cano</w:t>
-      </w:r>
-      <w:proofErr w:type="spellEnd"/>
-      <w:r>
-        <w:rPr>
-          <w:rFonts w:ascii="Times-Roman" w:eastAsia="Times-Roman" w:hAnsi="Times-Roman" w:cs="Times-Roman"/>
-          <w:sz w:val="24"/>
-        </w:rPr>
-        <w:t>} mm de comprimento (todas as medidas aproximadas);{/</w:t>
-      </w:r>
-      <w:proofErr w:type="spellStart"/>
-      <w:r>
-        <w:rPr>
-          <w:rFonts w:ascii="Times-Roman" w:eastAsia="Times-Roman" w:hAnsi="Times-Roman" w:cs="Times-Roman"/>
-          <w:sz w:val="24"/>
-        </w:rPr>
-        <w:t>is_fuzil</w:t>
-      </w:r>
-      <w:proofErr w:type="spellEnd"/>
-      <w:r>
-        <w:rPr>
-          <w:rFonts w:ascii="Times-Roman" w:eastAsia="Times-Roman" w:hAnsi="Times-Roman" w:cs="Times-Roman"/>
-          <w:sz w:val="24"/>
-        </w:rPr>
-        <w:t>}{#</w:t>
-      </w:r>
-      <w:proofErr w:type="spellStart"/>
-      <w:r>
-        <w:rPr>
-          <w:rFonts w:ascii="Times-Roman" w:eastAsia="Times-Roman" w:hAnsi="Times-Roman" w:cs="Times-Roman"/>
-          <w:sz w:val="24"/>
-        </w:rPr>
-        <w:t>is_municao_isolada</w:t>
-      </w:r>
-      <w:proofErr w:type="spellEnd"/>
-      <w:r>
-        <w:rPr>
-          <w:rFonts w:ascii="Times-Roman" w:eastAsia="Times-Roman" w:hAnsi="Times-Roman" w:cs="Times-Roman"/>
-          <w:sz w:val="24"/>
-        </w:rPr>
-        <w:t>}</w:t>
-      </w:r>
-      <w:r>
-        <w:t xml:space="preserve"> </w:t>
-      </w:r>
-      <w:r>
-        <w:rPr>
-          <w:rFonts w:ascii="Times-Roman" w:eastAsia="Times-Roman" w:hAnsi="Times-Roman" w:cs="Times-Roman"/>
-          <w:sz w:val="24"/>
-        </w:rPr>
-        <w:t>e) {</w:t>
-      </w:r>
-      <w:proofErr w:type="spellStart"/>
-      <w:r>
-        <w:rPr>
-          <w:rFonts w:ascii="Times-Roman" w:eastAsia="Times-Roman" w:hAnsi="Times-Roman" w:cs="Times-Roman"/>
-          <w:sz w:val="24"/>
-        </w:rPr>
-        <w:t>municoes_detalhes</w:t>
-      </w:r>
-      <w:proofErr w:type="spellEnd"/>
-      <w:r>
-        <w:rPr>
-          <w:rFonts w:ascii="Times-Roman" w:eastAsia="Times-Roman" w:hAnsi="Times-Roman" w:cs="Times-Roman"/>
-          <w:sz w:val="24"/>
-        </w:rPr>
-        <w:t xml:space="preserve">} </w:t>
-      </w:r>
-      <w:r>
-        <w:rPr>
-          <w:rFonts w:ascii="Times-Roman" w:eastAsia="Times-Roman" w:hAnsi="Times-Roman" w:cs="Times-Roman"/>
-          <w:sz w:val="24"/>
-        </w:rPr>
-        <w:t>{/</w:t>
-      </w:r>
-      <w:proofErr w:type="spellStart"/>
-      <w:r>
-        <w:rPr>
-          <w:rFonts w:ascii="Times-Roman" w:eastAsia="Times-Roman" w:hAnsi="Times-Roman" w:cs="Times-Roman"/>
-          <w:sz w:val="24"/>
-        </w:rPr>
-        <w:t>is_municao_isolada</w:t>
-      </w:r>
-      <w:proofErr w:type="spellEnd"/>
-      <w:r>
-        <w:rPr>
-          <w:rFonts w:ascii="Times-Roman" w:eastAsia="Times-Roman" w:hAnsi="Times-Roman" w:cs="Times-Roman"/>
-          <w:sz w:val="24"/>
-        </w:rPr>
-        <w:t>}{#</w:t>
-      </w:r>
-      <w:proofErr w:type="spellStart"/>
-      <w:r>
-        <w:rPr>
-          <w:rFonts w:ascii="Times-Roman" w:eastAsia="Times-Roman" w:hAnsi="Times-Roman" w:cs="Times-Roman"/>
-          <w:sz w:val="24"/>
-        </w:rPr>
-        <w:t>is_coringa</w:t>
-      </w:r>
-      <w:proofErr w:type="spellEnd"/>
-      <w:r>
-        <w:rPr>
-          <w:rFonts w:ascii="Times-Roman" w:eastAsia="Times-Roman" w:hAnsi="Times-Roman" w:cs="Times-Roman"/>
-          <w:sz w:val="24"/>
-        </w:rPr>
-        <w:t>}f) 01 (uma) {</w:t>
-      </w:r>
-      <w:proofErr w:type="spellStart"/>
-      <w:r>
-        <w:rPr>
-          <w:rFonts w:ascii="Times-Roman" w:eastAsia="Times-Roman" w:hAnsi="Times-Roman" w:cs="Times-Roman"/>
-          <w:sz w:val="24"/>
-        </w:rPr>
-        <w:t>nome_arma_livre</w:t>
-      </w:r>
-      <w:proofErr w:type="spellEnd"/>
-      <w:r>
-        <w:rPr>
-          <w:rFonts w:ascii="Times-Roman" w:eastAsia="Times-Roman" w:hAnsi="Times-Roman" w:cs="Times-Roman"/>
-          <w:sz w:val="24"/>
-        </w:rPr>
-        <w:t>}{#</w:t>
-      </w:r>
-      <w:proofErr w:type="spellStart"/>
-      <w:r>
-        <w:rPr>
-          <w:rFonts w:ascii="Times-Roman" w:eastAsia="Times-Roman" w:hAnsi="Times-Roman" w:cs="Times-Roman"/>
-          <w:sz w:val="24"/>
-        </w:rPr>
-        <w:t>is_pm</w:t>
-      </w:r>
-      <w:proofErr w:type="spellEnd"/>
-      <w:r>
-        <w:rPr>
-          <w:rFonts w:ascii="Times-Roman" w:eastAsia="Times-Roman" w:hAnsi="Times-Roman" w:cs="Times-Roman"/>
-          <w:sz w:val="24"/>
-        </w:rPr>
-        <w:t>}, pertencente à carga da {</w:t>
-      </w:r>
-      <w:proofErr w:type="spellStart"/>
-      <w:r>
-        <w:rPr>
-          <w:rFonts w:ascii="Times-Roman" w:eastAsia="Times-Roman" w:hAnsi="Times-Roman" w:cs="Times-Roman"/>
-          <w:sz w:val="24"/>
-        </w:rPr>
-        <w:t>instituicao_carga</w:t>
-      </w:r>
-      <w:proofErr w:type="spellEnd"/>
-      <w:r>
-        <w:rPr>
-          <w:rFonts w:ascii="Times-Roman" w:eastAsia="Times-Roman" w:hAnsi="Times-Roman" w:cs="Times-Roman"/>
-          <w:sz w:val="24"/>
-        </w:rPr>
-        <w:t>}{/</w:t>
-      </w:r>
-      <w:proofErr w:type="spellStart"/>
-      <w:r>
-        <w:rPr>
-          <w:rFonts w:ascii="Times-Roman" w:eastAsia="Times-Roman" w:hAnsi="Times-Roman" w:cs="Times-Roman"/>
-          <w:sz w:val="24"/>
-        </w:rPr>
-        <w:t>is_pm</w:t>
-      </w:r>
-      <w:proofErr w:type="spellEnd"/>
-      <w:r>
-        <w:rPr>
-          <w:rFonts w:ascii="Times-Roman" w:eastAsia="Times-Roman" w:hAnsi="Times-Roman" w:cs="Times-Roman"/>
-          <w:sz w:val="24"/>
-        </w:rPr>
-        <w:t>}, calibre {calibre}, marca {marca}, modelo {modelo}, número de série {</w:t>
-      </w:r>
-      <w:proofErr w:type="spellStart"/>
-      <w:r>
-        <w:rPr>
-          <w:rFonts w:ascii="Times-Roman" w:eastAsia="Times-Roman" w:hAnsi="Times-Roman" w:cs="Times-Roman"/>
-          <w:sz w:val="24"/>
-        </w:rPr>
-        <w:t>numero_serie</w:t>
-      </w:r>
-      <w:proofErr w:type="spellEnd"/>
-      <w:r>
-        <w:rPr>
-          <w:rFonts w:ascii="Times-Roman" w:eastAsia="Times-Roman" w:hAnsi="Times-Roman" w:cs="Times-Roman"/>
-          <w:sz w:val="24"/>
-        </w:rPr>
-        <w:t>}, acabamento {acabamento}, {</w:t>
-      </w:r>
-      <w:proofErr w:type="spellStart"/>
-      <w:r>
-        <w:rPr>
-          <w:rFonts w:ascii="Times-Roman" w:eastAsia="Times-Roman" w:hAnsi="Times-Roman" w:cs="Times-Roman"/>
-          <w:sz w:val="24"/>
-        </w:rPr>
         <w:t>descricao_livre</w:t>
       </w:r>
       <w:proofErr w:type="spellEnd"/>
@@ -895,7 +1048,15 @@
           <w:rFonts w:ascii="Times-Roman" w:eastAsia="Times-Roman" w:hAnsi="Times-Roman" w:cs="Times-Roman"/>
           <w:sz w:val="24"/>
         </w:rPr>
-        <w:t>}, cano medindo aproximadamente {</w:t>
+        <w:t xml:space="preserve">}, cano </w:t>
+      </w:r>
+      <w:r>
+        <w:rPr>
+          <w:rFonts w:ascii="Times-Roman" w:eastAsia="Times-Roman" w:hAnsi="Times-Roman" w:cs="Times-Roman"/>
+          <w:sz w:val="24"/>
+        </w:rPr>
+        <w:lastRenderedPageBreak/>
+        <w:t>medindo aproximadamente {</w:t>
       </w:r>
       <w:proofErr w:type="spellStart"/>
       <w:r>
@@ -985,7 +1146,6 @@
           <w:rFonts w:ascii="Times-Roman" w:eastAsia="Times-Roman" w:hAnsi="Times-Roman" w:cs="Times-Roman"/>
           <w:sz w:val="24"/>
         </w:rPr>
-        <w:lastRenderedPageBreak/>
         <w:t>Os exames restringiram-se à realização de disparos horizontais a fim de verificar se houve a percussão e a deflagração das munições relacionadas.</w:t>
       </w:r>
     </w:p>
@@ -1563,6 +1723,7 @@
           <w:rFonts w:ascii="Times-Roman" w:eastAsia="Times-Roman" w:hAnsi="Times-Roman" w:cs="Times-Roman"/>
           <w:sz w:val="24"/>
         </w:rPr>
+        <w:lastRenderedPageBreak/>
         <w:t xml:space="preserve">Com os cartuchos intactos em questão, foram realizados os testes de eficiência e verificaram os examinadores que os mesmos podiam ser utilizados e vir a ofender a integridade física de alguém, </w:t>
       </w:r>
       <w:proofErr w:type="gramStart"/>
@@ -1668,7 +1829,6 @@
           <w:rFonts w:ascii="Times-Roman" w:eastAsia="Times-Roman" w:hAnsi="Times-Roman" w:cs="Times-Roman"/>
           <w:sz w:val="24"/>
         </w:rPr>
-        <w:lastRenderedPageBreak/>
         <w:t>Com os cartuchos intactos incriminados em questão, utilizando armamento compatível e disponível nesta Seção à época dos exames, foram realizados testes de eficiência, verificando o examinador que os mesmos não funcionaram devido à deterioração dos componentes internos dos cartuchos (espoleta e pólvora) e, portanto, apresentando-se INEFICIENTES para produção de disparo.</w:t>
       </w:r>
     </w:p>
@@ -2037,6 +2197,7 @@
           <w:rFonts w:ascii="Times-Roman" w:eastAsia="Times-Roman" w:hAnsi="Times-Roman" w:cs="Times-Roman"/>
           <w:sz w:val="24"/>
         </w:rPr>
+        <w:lastRenderedPageBreak/>
         <w:t>TOCHETTO, Domingos. Balística Forense. Aspectos Técnicos e Jurídicos. 10. ed. Campinas: Millennium, 2020.</w:t>
       </w:r>
     </w:p>
@@ -2175,7 +2336,7 @@
                 <w:bCs/>
                 <w:noProof/>
               </w:rPr>
-              <w:t>2</w:t>
+              <w:t>4</w:t>
             </w:r>
             <w:r>
               <w:rPr>
@@ -2215,7 +2376,7 @@
                 <w:bCs/>
                 <w:noProof/>
               </w:rPr>
-              <w:t>3</w:t>
+              <w:t>4</w:t>
             </w:r>
             <w:r>
               <w:rPr>

</xml_diff>